<commit_message>
CS1105 Unit 5: 1.5 line spacing and left-aligned headings in Word output
Co-Authored-By: Claude Opus 5.5 <noreply@anthropic.com>
</commit_message>
<xml_diff>
--- a/CS1105_Digital_Electronics_Architecture/Unit5_Memory_Programmable_Logic/Assignment/Unit5_Assignment_Activity.docx
+++ b/CS1105_Digital_Electronics_Architecture/Unit5_Memory_Programmable_Logic/Assignment/Unit5_Assignment_Activity.docx
@@ -4,22 +4,22 @@
   <w:body>
     <w:p>
       <w:pPr>
-        <w:spacing w:line="480" w:lineRule="auto" w:after="0"/>
+        <w:spacing w:line="360" w:lineRule="auto" w:after="0"/>
       </w:pPr>
     </w:p>
     <w:p>
       <w:pPr>
-        <w:spacing w:line="480" w:lineRule="auto" w:after="0"/>
+        <w:spacing w:line="360" w:lineRule="auto" w:after="0"/>
       </w:pPr>
     </w:p>
     <w:p>
       <w:pPr>
-        <w:spacing w:line="480" w:lineRule="auto" w:after="0"/>
+        <w:spacing w:line="360" w:lineRule="auto" w:after="0"/>
       </w:pPr>
     </w:p>
     <w:p>
       <w:pPr>
-        <w:spacing w:line="480" w:lineRule="auto" w:after="0"/>
+        <w:spacing w:line="360" w:lineRule="auto" w:after="0"/>
       </w:pPr>
     </w:p>
     <w:p>
@@ -39,12 +39,12 @@
     </w:p>
     <w:p>
       <w:pPr>
-        <w:spacing w:line="480" w:lineRule="auto" w:after="0"/>
+        <w:spacing w:line="360" w:lineRule="auto" w:after="0"/>
       </w:pPr>
     </w:p>
     <w:p>
       <w:pPr>
-        <w:spacing w:line="480" w:lineRule="auto" w:after="0"/>
+        <w:spacing w:line="360" w:lineRule="auto" w:after="0"/>
         <w:jc w:val="center"/>
       </w:pPr>
       <w:r>
@@ -59,7 +59,7 @@
     </w:p>
     <w:p>
       <w:pPr>
-        <w:spacing w:line="480" w:lineRule="auto" w:after="0"/>
+        <w:spacing w:line="360" w:lineRule="auto" w:after="0"/>
         <w:jc w:val="center"/>
       </w:pPr>
       <w:r>
@@ -74,7 +74,7 @@
     </w:p>
     <w:p>
       <w:pPr>
-        <w:spacing w:line="480" w:lineRule="auto" w:after="0"/>
+        <w:spacing w:line="360" w:lineRule="auto" w:after="0"/>
         <w:jc w:val="center"/>
       </w:pPr>
       <w:r>
@@ -89,7 +89,7 @@
     </w:p>
     <w:p>
       <w:pPr>
-        <w:spacing w:line="480" w:lineRule="auto" w:after="0"/>
+        <w:spacing w:line="360" w:lineRule="auto" w:after="0"/>
         <w:jc w:val="center"/>
       </w:pPr>
       <w:r>
@@ -104,7 +104,7 @@
     </w:p>
     <w:p>
       <w:pPr>
-        <w:spacing w:line="480" w:lineRule="auto" w:after="0"/>
+        <w:spacing w:line="360" w:lineRule="auto" w:after="0"/>
         <w:jc w:val="center"/>
       </w:pPr>
       <w:r>
@@ -125,7 +125,7 @@
     <w:p>
       <w:pPr>
         <w:pStyle w:val="Heading1"/>
-        <w:jc w:val="center"/>
+        <w:jc w:val="left"/>
       </w:pPr>
       <w:r>
         <w:rPr>
@@ -139,7 +139,7 @@
     </w:p>
     <w:p>
       <w:pPr>
-        <w:spacing w:line="480" w:lineRule="auto" w:after="200"/>
+        <w:spacing w:line="360" w:lineRule="auto" w:after="200"/>
       </w:pPr>
       <w:r>
         <w:rPr>
@@ -154,7 +154,7 @@
     <w:p>
       <w:pPr>
         <w:pStyle w:val="Heading1"/>
-        <w:jc w:val="center"/>
+        <w:jc w:val="left"/>
       </w:pPr>
       <w:r>
         <w:rPr>
@@ -169,6 +169,7 @@
     <w:p>
       <w:pPr>
         <w:pStyle w:val="Heading2"/>
+        <w:jc w:val="left"/>
       </w:pPr>
       <w:r>
         <w:rPr>
@@ -182,7 +183,7 @@
     </w:p>
     <w:p>
       <w:pPr>
-        <w:spacing w:line="480" w:lineRule="auto" w:after="200"/>
+        <w:spacing w:line="360" w:lineRule="auto" w:after="200"/>
       </w:pPr>
       <w:r>
         <w:rPr>
@@ -196,7 +197,7 @@
     </w:p>
     <w:p>
       <w:pPr>
-        <w:spacing w:line="480" w:lineRule="auto" w:after="0"/>
+        <w:spacing w:line="360" w:lineRule="auto" w:after="0"/>
       </w:pPr>
       <w:r>
         <w:rPr>
@@ -210,7 +211,7 @@
     </w:p>
     <w:p>
       <w:pPr>
-        <w:spacing w:line="480" w:lineRule="auto" w:after="0"/>
+        <w:spacing w:line="360" w:lineRule="auto" w:after="0"/>
       </w:pPr>
       <w:r>
         <w:rPr>
@@ -690,6 +691,7 @@
     <w:p>
       <w:pPr>
         <w:pStyle w:val="Heading2"/>
+        <w:jc w:val="left"/>
       </w:pPr>
       <w:r>
         <w:rPr>
@@ -703,7 +705,7 @@
     </w:p>
     <w:p>
       <w:pPr>
-        <w:spacing w:line="480" w:lineRule="auto" w:after="200"/>
+        <w:spacing w:line="360" w:lineRule="auto" w:after="200"/>
       </w:pPr>
       <w:r>
         <w:rPr>
@@ -1014,7 +1016,7 @@
     </w:p>
     <w:p>
       <w:pPr>
-        <w:spacing w:line="480" w:lineRule="auto" w:after="200"/>
+        <w:spacing w:line="360" w:lineRule="auto" w:after="200"/>
       </w:pPr>
       <w:r>
         <w:rPr>
@@ -1138,6 +1140,7 @@
     <w:p>
       <w:pPr>
         <w:pStyle w:val="Heading2"/>
+        <w:jc w:val="left"/>
       </w:pPr>
       <w:r>
         <w:rPr>
@@ -1273,7 +1276,7 @@
     </w:p>
     <w:p>
       <w:pPr>
-        <w:spacing w:line="480" w:lineRule="auto" w:after="200"/>
+        <w:spacing w:line="360" w:lineRule="auto" w:after="200"/>
       </w:pPr>
       <w:r>
         <w:rPr>
@@ -1288,6 +1291,7 @@
     <w:p>
       <w:pPr>
         <w:pStyle w:val="Heading2"/>
+        <w:jc w:val="left"/>
       </w:pPr>
       <w:r>
         <w:rPr>
@@ -1301,7 +1305,7 @@
     </w:p>
     <w:p>
       <w:pPr>
-        <w:spacing w:line="480" w:lineRule="auto" w:after="200"/>
+        <w:spacing w:line="360" w:lineRule="auto" w:after="200"/>
       </w:pPr>
       <w:r>
         <w:rPr>
@@ -1315,7 +1319,7 @@
     </w:p>
     <w:p>
       <w:pPr>
-        <w:spacing w:line="480" w:lineRule="auto" w:after="0"/>
+        <w:spacing w:line="360" w:lineRule="auto" w:after="0"/>
       </w:pPr>
       <w:r>
         <w:rPr>
@@ -1329,7 +1333,7 @@
     </w:p>
     <w:p>
       <w:pPr>
-        <w:spacing w:line="480" w:lineRule="auto" w:after="0"/>
+        <w:spacing w:line="360" w:lineRule="auto" w:after="0"/>
       </w:pPr>
       <w:r>
         <w:rPr>
@@ -1384,6 +1388,7 @@
     <w:p>
       <w:pPr>
         <w:pStyle w:val="Heading2"/>
+        <w:jc w:val="left"/>
       </w:pPr>
       <w:r>
         <w:rPr>
@@ -1397,7 +1402,7 @@
     </w:p>
     <w:p>
       <w:pPr>
-        <w:spacing w:line="480" w:lineRule="auto" w:after="200"/>
+        <w:spacing w:line="360" w:lineRule="auto" w:after="200"/>
       </w:pPr>
       <w:r>
         <w:rPr>
@@ -1411,7 +1416,7 @@
     </w:p>
     <w:p>
       <w:pPr>
-        <w:spacing w:line="480" w:lineRule="auto" w:after="0"/>
+        <w:spacing w:line="360" w:lineRule="auto" w:after="0"/>
       </w:pPr>
       <w:r>
         <w:rPr>
@@ -1425,7 +1430,7 @@
     </w:p>
     <w:p>
       <w:pPr>
-        <w:spacing w:line="480" w:lineRule="auto" w:after="0"/>
+        <w:spacing w:line="360" w:lineRule="auto" w:after="0"/>
       </w:pPr>
       <w:r>
         <w:rPr>
@@ -2010,7 +2015,7 @@
     </w:p>
     <w:p>
       <w:pPr>
-        <w:spacing w:line="480" w:lineRule="auto" w:after="200"/>
+        <w:spacing w:line="360" w:lineRule="auto" w:after="200"/>
       </w:pPr>
       <w:r>
         <w:rPr>
@@ -2024,7 +2029,7 @@
     </w:p>
     <w:p>
       <w:pPr>
-        <w:spacing w:line="480" w:lineRule="auto" w:after="0"/>
+        <w:spacing w:line="360" w:lineRule="auto" w:after="0"/>
       </w:pPr>
       <w:r>
         <w:rPr>
@@ -2038,7 +2043,7 @@
     </w:p>
     <w:p>
       <w:pPr>
-        <w:spacing w:line="480" w:lineRule="auto" w:after="0"/>
+        <w:spacing w:line="360" w:lineRule="auto" w:after="0"/>
       </w:pPr>
       <w:r>
         <w:rPr>
@@ -2092,7 +2097,7 @@
     </w:p>
     <w:p>
       <w:pPr>
-        <w:spacing w:line="480" w:lineRule="auto" w:after="0"/>
+        <w:spacing w:line="360" w:lineRule="auto" w:after="0"/>
       </w:pPr>
       <w:r>
         <w:rPr>
@@ -2106,7 +2111,7 @@
     </w:p>
     <w:p>
       <w:pPr>
-        <w:spacing w:line="480" w:lineRule="auto" w:after="0"/>
+        <w:spacing w:line="360" w:lineRule="auto" w:after="0"/>
       </w:pPr>
       <w:r>
         <w:rPr>
@@ -2161,7 +2166,7 @@
     <w:p>
       <w:pPr>
         <w:pStyle w:val="Heading1"/>
-        <w:jc w:val="center"/>
+        <w:jc w:val="left"/>
       </w:pPr>
       <w:r>
         <w:rPr>
@@ -2175,7 +2180,7 @@
     </w:p>
     <w:p>
       <w:pPr>
-        <w:spacing w:line="480" w:lineRule="auto" w:after="200"/>
+        <w:spacing w:line="360" w:lineRule="auto" w:after="200"/>
       </w:pPr>
       <w:r>
         <w:rPr>
@@ -2189,7 +2194,7 @@
     </w:p>
     <w:p>
       <w:pPr>
-        <w:spacing w:line="480" w:lineRule="auto" w:after="0"/>
+        <w:spacing w:line="360" w:lineRule="auto" w:after="0"/>
       </w:pPr>
       <w:r>
         <w:rPr>
@@ -2203,7 +2208,7 @@
     </w:p>
     <w:p>
       <w:pPr>
-        <w:spacing w:line="480" w:lineRule="auto" w:after="0"/>
+        <w:spacing w:line="360" w:lineRule="auto" w:after="0"/>
       </w:pPr>
       <w:r>
         <w:rPr>
@@ -3130,7 +3135,7 @@
     </w:p>
     <w:p>
       <w:pPr>
-        <w:spacing w:line="480" w:lineRule="auto" w:after="200"/>
+        <w:spacing w:line="360" w:lineRule="auto" w:after="200"/>
       </w:pPr>
       <w:r>
         <w:rPr>
@@ -3144,7 +3149,7 @@
     </w:p>
     <w:p>
       <w:pPr>
-        <w:spacing w:line="480" w:lineRule="auto" w:after="200"/>
+        <w:spacing w:line="360" w:lineRule="auto" w:after="200"/>
       </w:pPr>
       <w:r>
         <w:rPr>
@@ -3167,7 +3172,7 @@
     </w:p>
     <w:p>
       <w:pPr>
-        <w:spacing w:line="480" w:lineRule="auto" w:after="200"/>
+        <w:spacing w:line="360" w:lineRule="auto" w:after="200"/>
       </w:pPr>
       <w:r>
         <w:rPr>
@@ -3190,7 +3195,7 @@
     </w:p>
     <w:p>
       <w:pPr>
-        <w:spacing w:line="480" w:lineRule="auto" w:after="200"/>
+        <w:spacing w:line="360" w:lineRule="auto" w:after="200"/>
       </w:pPr>
       <w:r>
         <w:rPr>
@@ -3214,7 +3219,7 @@
     <w:p>
       <w:pPr>
         <w:pStyle w:val="Heading1"/>
-        <w:jc w:val="center"/>
+        <w:jc w:val="left"/>
       </w:pPr>
       <w:r>
         <w:rPr>
@@ -3229,6 +3234,7 @@
     <w:p>
       <w:pPr>
         <w:pStyle w:val="Heading2"/>
+        <w:jc w:val="left"/>
       </w:pPr>
       <w:r>
         <w:rPr>
@@ -3242,7 +3248,7 @@
     </w:p>
     <w:p>
       <w:pPr>
-        <w:spacing w:line="480" w:lineRule="auto" w:after="200"/>
+        <w:spacing w:line="360" w:lineRule="auto" w:after="200"/>
       </w:pPr>
       <w:r>
         <w:rPr>
@@ -3256,7 +3262,7 @@
     </w:p>
     <w:p>
       <w:pPr>
-        <w:spacing w:line="480" w:lineRule="auto" w:after="200"/>
+        <w:spacing w:line="360" w:lineRule="auto" w:after="200"/>
       </w:pPr>
       <w:r>
         <w:rPr>
@@ -3270,7 +3276,7 @@
     </w:p>
     <w:p>
       <w:pPr>
-        <w:spacing w:line="480" w:lineRule="auto" w:after="0"/>
+        <w:spacing w:line="360" w:lineRule="auto" w:after="0"/>
       </w:pPr>
       <w:r>
         <w:rPr>
@@ -3284,7 +3290,7 @@
     </w:p>
     <w:p>
       <w:pPr>
-        <w:spacing w:line="480" w:lineRule="auto" w:after="0"/>
+        <w:spacing w:line="360" w:lineRule="auto" w:after="0"/>
       </w:pPr>
       <w:r>
         <w:rPr>
@@ -4198,7 +4204,7 @@
     </w:p>
     <w:p>
       <w:pPr>
-        <w:spacing w:line="480" w:lineRule="auto" w:after="200"/>
+        <w:spacing w:line="360" w:lineRule="auto" w:after="200"/>
       </w:pPr>
       <w:r>
         <w:rPr>
@@ -4213,6 +4219,7 @@
     <w:p>
       <w:pPr>
         <w:pStyle w:val="Heading2"/>
+        <w:jc w:val="left"/>
       </w:pPr>
       <w:r>
         <w:rPr>
@@ -4226,7 +4233,7 @@
     </w:p>
     <w:p>
       <w:pPr>
-        <w:spacing w:line="480" w:lineRule="auto" w:after="200"/>
+        <w:spacing w:line="360" w:lineRule="auto" w:after="200"/>
       </w:pPr>
       <w:r>
         <w:rPr>
@@ -4249,7 +4256,7 @@
     </w:p>
     <w:p>
       <w:pPr>
-        <w:spacing w:line="480" w:lineRule="auto" w:after="200"/>
+        <w:spacing w:line="360" w:lineRule="auto" w:after="200"/>
       </w:pPr>
       <w:r>
         <w:rPr>
@@ -4263,7 +4270,7 @@
     </w:p>
     <w:p>
       <w:pPr>
-        <w:spacing w:line="480" w:lineRule="auto" w:after="0"/>
+        <w:spacing w:line="360" w:lineRule="auto" w:after="0"/>
       </w:pPr>
       <w:r>
         <w:rPr>
@@ -4277,7 +4284,7 @@
     </w:p>
     <w:p>
       <w:pPr>
-        <w:spacing w:line="480" w:lineRule="auto" w:after="0"/>
+        <w:spacing w:line="360" w:lineRule="auto" w:after="0"/>
       </w:pPr>
       <w:r>
         <w:rPr>
@@ -4644,7 +4651,7 @@
     </w:p>
     <w:p>
       <w:pPr>
-        <w:spacing w:line="480" w:lineRule="auto" w:after="200"/>
+        <w:spacing w:line="360" w:lineRule="auto" w:after="200"/>
       </w:pPr>
       <w:r>
         <w:rPr>
@@ -4667,7 +4674,7 @@
     </w:p>
     <w:p>
       <w:pPr>
-        <w:spacing w:line="480" w:lineRule="auto" w:after="200"/>
+        <w:spacing w:line="360" w:lineRule="auto" w:after="200"/>
       </w:pPr>
       <w:r>
         <w:rPr>
@@ -4690,7 +4697,7 @@
     </w:p>
     <w:p>
       <w:pPr>
-        <w:spacing w:line="480" w:lineRule="auto" w:after="200"/>
+        <w:spacing w:line="360" w:lineRule="auto" w:after="200"/>
       </w:pPr>
       <w:r>
         <w:rPr>
@@ -4714,6 +4721,7 @@
     <w:p>
       <w:pPr>
         <w:pStyle w:val="Heading2"/>
+        <w:jc w:val="left"/>
       </w:pPr>
       <w:r>
         <w:rPr>
@@ -4727,7 +4735,7 @@
     </w:p>
     <w:p>
       <w:pPr>
-        <w:spacing w:line="480" w:lineRule="auto" w:after="200"/>
+        <w:spacing w:line="360" w:lineRule="auto" w:after="200"/>
       </w:pPr>
       <w:r>
         <w:rPr>
@@ -4742,7 +4750,7 @@
     <w:p>
       <w:pPr>
         <w:pStyle w:val="Heading1"/>
-        <w:jc w:val="center"/>
+        <w:jc w:val="left"/>
       </w:pPr>
       <w:r>
         <w:rPr>
@@ -4756,7 +4764,7 @@
     </w:p>
     <w:p>
       <w:pPr>
-        <w:spacing w:line="480" w:lineRule="auto" w:after="200"/>
+        <w:spacing w:line="360" w:lineRule="auto" w:after="200"/>
       </w:pPr>
       <w:r>
         <w:rPr>
@@ -4770,7 +4778,7 @@
     </w:p>
     <w:p>
       <w:pPr>
-        <w:spacing w:line="480" w:lineRule="auto" w:after="0"/>
+        <w:spacing w:line="360" w:lineRule="auto" w:after="0"/>
         <w:ind w:left="720" w:hanging="360"/>
       </w:pPr>
       <w:r>
@@ -4803,7 +4811,7 @@
     </w:p>
     <w:p>
       <w:pPr>
-        <w:spacing w:line="480" w:lineRule="auto" w:after="0"/>
+        <w:spacing w:line="360" w:lineRule="auto" w:after="0"/>
         <w:ind w:left="720" w:hanging="360"/>
       </w:pPr>
       <w:r>
@@ -4836,7 +4844,7 @@
     </w:p>
     <w:p>
       <w:pPr>
-        <w:spacing w:line="480" w:lineRule="auto" w:after="0"/>
+        <w:spacing w:line="360" w:lineRule="auto" w:after="0"/>
         <w:ind w:left="720" w:hanging="360"/>
       </w:pPr>
       <w:r>
@@ -4869,7 +4877,7 @@
     </w:p>
     <w:p>
       <w:pPr>
-        <w:spacing w:line="480" w:lineRule="auto" w:after="200"/>
+        <w:spacing w:line="360" w:lineRule="auto" w:after="200"/>
       </w:pPr>
       <w:r>
         <w:rPr>
@@ -4883,7 +4891,7 @@
     </w:p>
     <w:p>
       <w:pPr>
-        <w:spacing w:line="480" w:lineRule="auto" w:after="0"/>
+        <w:spacing w:line="360" w:lineRule="auto" w:after="0"/>
         <w:ind w:left="720" w:hanging="360"/>
       </w:pPr>
       <w:r>
@@ -4916,7 +4924,7 @@
     </w:p>
     <w:p>
       <w:pPr>
-        <w:spacing w:line="480" w:lineRule="auto" w:after="0"/>
+        <w:spacing w:line="360" w:lineRule="auto" w:after="0"/>
         <w:ind w:left="720" w:hanging="360"/>
       </w:pPr>
       <w:r>
@@ -4949,7 +4957,7 @@
     </w:p>
     <w:p>
       <w:pPr>
-        <w:spacing w:line="480" w:lineRule="auto" w:after="0"/>
+        <w:spacing w:line="360" w:lineRule="auto" w:after="0"/>
         <w:ind w:left="720" w:hanging="360"/>
       </w:pPr>
       <w:r>
@@ -4982,7 +4990,7 @@
     </w:p>
     <w:p>
       <w:pPr>
-        <w:spacing w:line="480" w:lineRule="auto" w:after="0"/>
+        <w:spacing w:line="360" w:lineRule="auto" w:after="0"/>
         <w:ind w:left="720" w:hanging="360"/>
       </w:pPr>
       <w:r>
@@ -5015,7 +5023,7 @@
     </w:p>
     <w:p>
       <w:pPr>
-        <w:spacing w:line="480" w:lineRule="auto" w:after="200"/>
+        <w:spacing w:line="360" w:lineRule="auto" w:after="200"/>
       </w:pPr>
       <w:r>
         <w:rPr>
@@ -5030,7 +5038,7 @@
     <w:p>
       <w:pPr>
         <w:pStyle w:val="Heading1"/>
-        <w:jc w:val="center"/>
+        <w:jc w:val="left"/>
       </w:pPr>
       <w:r>
         <w:rPr>
@@ -5044,7 +5052,7 @@
     </w:p>
     <w:p>
       <w:pPr>
-        <w:spacing w:line="480" w:lineRule="auto" w:after="200"/>
+        <w:spacing w:line="360" w:lineRule="auto" w:after="200"/>
       </w:pPr>
       <w:r>
         <w:rPr>
@@ -5064,7 +5072,7 @@
     <w:p>
       <w:pPr>
         <w:pStyle w:val="Heading1"/>
-        <w:jc w:val="center"/>
+        <w:jc w:val="left"/>
       </w:pPr>
       <w:r>
         <w:rPr>
@@ -5078,7 +5086,7 @@
     </w:p>
     <w:p>
       <w:pPr>
-        <w:spacing w:line="480" w:lineRule="auto" w:after="0"/>
+        <w:spacing w:line="360" w:lineRule="auto" w:after="0"/>
         <w:ind w:left="720" w:hanging="720"/>
       </w:pPr>
       <w:r>
@@ -5122,7 +5130,7 @@
     </w:p>
     <w:p>
       <w:pPr>
-        <w:spacing w:line="480" w:lineRule="auto" w:after="0"/>
+        <w:spacing w:line="360" w:lineRule="auto" w:after="0"/>
         <w:ind w:left="720" w:hanging="720"/>
       </w:pPr>
       <w:r>
@@ -5166,7 +5174,7 @@
     </w:p>
     <w:p>
       <w:pPr>
-        <w:spacing w:line="480" w:lineRule="auto" w:after="0"/>
+        <w:spacing w:line="360" w:lineRule="auto" w:after="0"/>
         <w:ind w:left="720" w:hanging="720"/>
       </w:pPr>
       <w:r>
@@ -5603,7 +5611,7 @@
     <w:qFormat/>
     <w:rsid w:val="00FC693F"/>
     <w:pPr>
-      <w:spacing w:line="480" w:lineRule="auto" w:after="0"/>
+      <w:spacing w:line="360" w:lineRule="auto" w:after="0"/>
     </w:pPr>
     <w:rPr>
       <w:rFonts w:ascii="Times New Roman" w:hAnsi="Times New Roman"/>
@@ -5665,7 +5673,7 @@
     <w:pPr>
       <w:keepNext/>
       <w:keepLines/>
-      <w:spacing w:before="0" w:after="0" w:line="480" w:lineRule="auto"/>
+      <w:spacing w:before="0" w:after="0" w:line="360" w:lineRule="auto"/>
       <w:outlineLvl w:val="0"/>
     </w:pPr>
     <w:rPr>
@@ -5689,7 +5697,7 @@
     <w:pPr>
       <w:keepNext/>
       <w:keepLines/>
-      <w:spacing w:before="0" w:after="0" w:line="480" w:lineRule="auto"/>
+      <w:spacing w:before="0" w:after="0" w:line="360" w:lineRule="auto"/>
       <w:outlineLvl w:val="1"/>
     </w:pPr>
     <w:rPr>
@@ -5713,7 +5721,7 @@
     <w:pPr>
       <w:keepNext/>
       <w:keepLines/>
-      <w:spacing w:before="0" w:after="0" w:line="480" w:lineRule="auto"/>
+      <w:spacing w:before="0" w:after="0" w:line="360" w:lineRule="auto"/>
       <w:outlineLvl w:val="2"/>
     </w:pPr>
     <w:rPr>
@@ -5955,7 +5963,7 @@
       <w:pBdr>
         <w:bottom w:val="single" w:sz="8" w:space="4" w:color="4F81BD" w:themeColor="accent1"/>
       </w:pBdr>
-      <w:spacing w:after="0" w:line="480" w:lineRule="auto" w:before="0"/>
+      <w:spacing w:after="0" w:line="360" w:lineRule="auto" w:before="0"/>
       <w:contextualSpacing/>
     </w:pPr>
     <w:rPr>

</xml_diff>